<commit_message>
impagina-kos: sottotitolo configurabile; schede Google con il sottotitolo della linea C
Co-Authored-By: Claude Opus 5.5 <noreply@anthropic.com>
Claude-Session: https://claude.ai/code/session_01Rr1X44gsg7BUwMzrRvYrc2
</commit_message>
<xml_diff>
--- a/docs/docx/schede-google-passaggio-retailtune.docx
+++ b/docs/docx/schede-google-passaggio-retailtune.docx
@@ -46,7 +46,7 @@
           <w:sz w:val="24"/>
           <w:szCs w:val="24"/>
         </w:rPr>
-        <w:t xml:space="preserve">Linee A e B · Ottimizzazione SEO/GEO di kosgroup.com e anniazzurri.it</w:t>
+        <w:t xml:space="preserve">Linea C · Migrazione da Yext a RetailTune</w:t>
       </w:r>
     </w:p>
     <w:p>
@@ -657,7 +657,7 @@
         </w:rPr>
         <w:t xml:space="preserve"> Le </w:t>
       </w:r>
-      <w:hyperlink w:history="1" r:id="rIdesj0duemeuyrgfb73jq6v">
+      <w:hyperlink w:history="1" r:id="rIdnen-qbpuvv9xkv0a1ddm0">
         <w:r>
           <w:rPr>
             <w:rFonts w:ascii="Arial" w:cs="Arial" w:eastAsia="Arial" w:hAnsi="Arial"/>

</xml_diff>

<commit_message>
impagina-kos: righe spezzate unite e titoli di terzo livello; schede Google rigenerato
Co-Authored-By: Claude Opus 5.5 <noreply@anthropic.com>
Claude-Session: https://claude.ai/code/session_01Rr1X44gsg7BUwMzrRvYrc2
</commit_message>
<xml_diff>
--- a/docs/docx/schede-google-passaggio-retailtune.docx
+++ b/docs/docx/schede-google-passaggio-retailtune.docx
@@ -78,37 +78,7 @@
           <w:sz w:val="21"/>
           <w:szCs w:val="21"/>
         </w:rPr>
-        <w:t xml:space="preserve">Con la migrazione da Yext a RetailTune, nomi, siti e categorie delle 138 schede Google di KOS e Anni Azzurri passano a</w:t>
-      </w:r>
-    </w:p>
-    <w:p>
-      <w:pPr>
-        <w:spacing w:after="120" w:before="0" w:line="290"/>
-        <w:jc w:val="both"/>
-      </w:pPr>
-      <w:r>
-        <w:rPr>
-          <w:rFonts w:ascii="Arial" w:cs="Arial" w:eastAsia="Arial" w:hAnsi="Arial"/>
-          <w:color w:val="20262B"/>
-          <w:sz w:val="21"/>
-          <w:szCs w:val="21"/>
-        </w:rPr>
-        <w:t xml:space="preserve">un nuovo strumento, che da quel momento li sincronizza. Questo documento fissa le regole per quei tre dati prima che</w:t>
-      </w:r>
-    </w:p>
-    <w:p>
-      <w:pPr>
-        <w:spacing w:after="120" w:before="0" w:line="290"/>
-        <w:jc w:val="both"/>
-      </w:pPr>
-      <w:r>
-        <w:rPr>
-          <w:rFonts w:ascii="Arial" w:cs="Arial" w:eastAsia="Arial" w:hAnsi="Arial"/>
-          <w:color w:val="20262B"/>
-          <w:sz w:val="21"/>
-          <w:szCs w:val="21"/>
-        </w:rPr>
-        <w:t xml:space="preserve">RetailTune inizi a scriverli. Tiene conto del documento «Local Ottimizzazioni e Linee Guida» del 27 ottobre.</w:t>
+        <w:t xml:space="preserve">Con la migrazione da Yext a RetailTune, nomi, siti e categorie delle 138 schede Google di KOS e Anni Azzurri passano a un nuovo strumento, che da quel momento li sincronizza. Questo documento fissa le regole per quei tre dati prima che RetailTune inizi a scriverli. Tiene conto del documento «Local Ottimizzazioni e Linee Guida» del 27 ottobre.</w:t>
       </w:r>
     </w:p>
     <w:p>
@@ -529,37 +499,7 @@
           <w:sz w:val="21"/>
           <w:szCs w:val="21"/>
         </w:rPr>
-        <w:t xml:space="preserve">Il motivo dei passi: ogni modifica passa una revisione di Google e una nuova categoria può richiedere una nuova verifica</w:t>
-      </w:r>
-    </w:p>
-    <w:p>
-      <w:pPr>
-        <w:spacing w:after="120" w:before="0" w:line="290"/>
-        <w:jc w:val="both"/>
-      </w:pPr>
-      <w:r>
-        <w:rPr>
-          <w:rFonts w:ascii="Arial" w:cs="Arial" w:eastAsia="Arial" w:hAnsi="Arial"/>
-          <w:color w:val="20262B"/>
-          <w:sz w:val="21"/>
-          <w:szCs w:val="21"/>
-        </w:rPr>
-        <w:t xml:space="preserve">dell'attività. Cambiando una cosa per volta si limitano le verifiche e ogni effetto si attribuisce a un solo cambiamento.</w:t>
-      </w:r>
-    </w:p>
-    <w:p>
-      <w:pPr>
-        <w:spacing w:after="120" w:before="0" w:line="290"/>
-        <w:jc w:val="both"/>
-      </w:pPr>
-      <w:r>
-        <w:rPr>
-          <w:rFonts w:ascii="Arial" w:cs="Arial" w:eastAsia="Arial" w:hAnsi="Arial"/>
-          <w:color w:val="20262B"/>
-          <w:sz w:val="21"/>
-          <w:szCs w:val="21"/>
-        </w:rPr>
-        <w:t xml:space="preserve">Le posizioni nelle ricerche sono misurate prima e dopo ogni passo.</w:t>
+        <w:t xml:space="preserve">Il motivo dei passi: ogni modifica passa una revisione di Google e una nuova categoria può richiedere una nuova verifica dell'attività. Cambiando una cosa per volta si limitano le verifiche e ogni effetto si attribuisce a un solo cambiamento. Le posizioni nelle ricerche sono misurate prima e dopo ogni passo.</w:t>
       </w:r>
     </w:p>
     <w:p>
@@ -594,22 +534,7 @@
           <w:sz w:val="21"/>
           <w:szCs w:val="21"/>
         </w:rPr>
-        <w:t xml:space="preserve">Il nome della scheda è il nome reale della struttura, lo stesso che compare sull'insegna, nella pagina del sito e nel dato</w:t>
-      </w:r>
-    </w:p>
-    <w:p>
-      <w:pPr>
-        <w:spacing w:after="120" w:before="0" w:line="290"/>
-        <w:jc w:val="both"/>
-      </w:pPr>
-      <w:r>
-        <w:rPr>
-          <w:rFonts w:ascii="Arial" w:cs="Arial" w:eastAsia="Arial" w:hAnsi="Arial"/>
-          <w:color w:val="20262B"/>
-          <w:sz w:val="21"/>
-          <w:szCs w:val="21"/>
-        </w:rPr>
-        <w:t xml:space="preserve">strutturato. Non si aggiungono parole chiave come «RSA», la città o i servizi.</w:t>
+        <w:t xml:space="preserve">Il nome della scheda è il nome reale della struttura, lo stesso che compare sull'insegna, nella pagina del sito e nel dato strutturato. Non si aggiungono parole chiave come «RSA», la città o i servizi.</w:t>
       </w:r>
     </w:p>
     <w:p>
@@ -657,7 +582,7 @@
         </w:rPr>
         <w:t xml:space="preserve"> Le </w:t>
       </w:r>
-      <w:hyperlink w:history="1" r:id="rIdnen-qbpuvv9xkv0a1ddm0">
+      <w:hyperlink w:history="1" r:id="rIdx9io8tvyg5xpsqgxxbukp">
         <w:r>
           <w:rPr>
             <w:rFonts w:ascii="Arial" w:cs="Arial" w:eastAsia="Arial" w:hAnsi="Arial"/>
@@ -669,12 +594,6 @@
           <w:t xml:space="preserve">linee guida per la rappresentazione</w:t>
         </w:r>
       </w:hyperlink>
-    </w:p>
-    <w:p>
-      <w:pPr>
-        <w:spacing w:after="120" w:before="180" w:line="290"/>
-        <w:jc w:val="both"/>
-      </w:pPr>
       <w:r>
         <w:rPr>
           <w:rFonts w:ascii="Arial" w:cs="Arial" w:eastAsia="Arial" w:hAnsi="Arial"/>
@@ -682,7 +601,7 @@
           <w:sz w:val="21"/>
           <w:szCs w:val="21"/>
         </w:rPr>
-        <w:t xml:space="preserve">  chiedono il nome usato nel mondo reale ed escludono esplicitamente parole chiave, località e servizi aggiunti.</w:t>
+        <w:t xml:space="preserve"> chiedono il nome usato nel mondo reale ed escludono esplicitamente parole chiave, località e servizi aggiunti.</w:t>
       </w:r>
     </w:p>
     <w:p>
@@ -713,22 +632,7 @@
           <w:sz w:val="21"/>
           <w:szCs w:val="21"/>
         </w:rPr>
-        <w:t xml:space="preserve"> Le schede di un gruppo con nomi modificati possono essere sospese insieme. Su 60</w:t>
-      </w:r>
-    </w:p>
-    <w:p>
-      <w:pPr>
-        <w:spacing w:after="120" w:before="180" w:line="290"/>
-        <w:jc w:val="both"/>
-      </w:pPr>
-      <w:r>
-        <w:rPr>
-          <w:rFonts w:ascii="Arial" w:cs="Arial" w:eastAsia="Arial" w:hAnsi="Arial"/>
-          <w:color w:val="20262B"/>
-          <w:sz w:val="21"/>
-          <w:szCs w:val="21"/>
-        </w:rPr>
-        <w:t xml:space="preserve">  residenze il danno sarebbe molto più grande di qualsiasi guadagno di posizione.</w:t>
+        <w:t xml:space="preserve"> Le schede di un gruppo con nomi modificati possono essere sospese insieme. Su 60 residenze il danno sarebbe molto più grande di qualsiasi guadagno di posizione.</w:t>
       </w:r>
     </w:p>
     <w:p>
@@ -759,22 +663,7 @@
           <w:sz w:val="21"/>
           <w:szCs w:val="21"/>
         </w:rPr>
-        <w:t xml:space="preserve"> Google confronta il nome della scheda con quello del sito e delle directory. Un nome uguale</w:t>
-      </w:r>
-    </w:p>
-    <w:p>
-      <w:pPr>
-        <w:spacing w:after="120" w:before="180" w:line="290"/>
-        <w:jc w:val="both"/>
-      </w:pPr>
-      <w:r>
-        <w:rPr>
-          <w:rFonts w:ascii="Arial" w:cs="Arial" w:eastAsia="Arial" w:hAnsi="Arial"/>
-          <w:color w:val="20262B"/>
-          <w:sz w:val="21"/>
-          <w:szCs w:val="21"/>
-        </w:rPr>
-        <w:t xml:space="preserve">  dappertutto rafforza l'identità della struttura; un nome diverso la indebolisce.</w:t>
+        <w:t xml:space="preserve"> Google confronta il nome della scheda con quello del sito e delle directory. Un nome uguale dappertutto rafforza l'identità della struttura; un nome diverso la indebolisce.</w:t>
       </w:r>
     </w:p>
     <w:p>
@@ -805,7 +694,7 @@
           <w:sz w:val="21"/>
           <w:szCs w:val="21"/>
         </w:rPr>
-        <w:t xml:space="preserve"> Indica un'autorizzazione e un regime di accreditamento che va verificato struttura</w:t>
+        <w:t xml:space="preserve"> Indica un'autorizzazione e un regime di accreditamento che va verificato struttura per struttura.</w:t>
       </w:r>
     </w:p>
     <w:p>
@@ -820,37 +709,7 @@
           <w:sz w:val="21"/>
           <w:szCs w:val="21"/>
         </w:rPr>
-        <w:t xml:space="preserve">  per struttura.</w:t>
-      </w:r>
-    </w:p>
-    <w:p>
-      <w:pPr>
-        <w:spacing w:after="120" w:before="0" w:line="290"/>
-        <w:jc w:val="both"/>
-      </w:pPr>
-      <w:r>
-        <w:rPr>
-          <w:rFonts w:ascii="Arial" w:cs="Arial" w:eastAsia="Arial" w:hAnsi="Arial"/>
-          <w:color w:val="20262B"/>
-          <w:sz w:val="21"/>
-          <w:szCs w:val="21"/>
-        </w:rPr>
-        <w:t xml:space="preserve">Le parole chiave hanno altri posti, consentiti e utili: la categoria (sezione 4), i servizi della scheda, la descrizione</w:t>
-      </w:r>
-    </w:p>
-    <w:p>
-      <w:pPr>
-        <w:spacing w:after="120" w:before="0" w:line="290"/>
-        <w:jc w:val="both"/>
-      </w:pPr>
-      <w:r>
-        <w:rPr>
-          <w:rFonts w:ascii="Arial" w:cs="Arial" w:eastAsia="Arial" w:hAnsi="Arial"/>
-          <w:color w:val="20262B"/>
-          <w:sz w:val="21"/>
-          <w:szCs w:val="21"/>
-        </w:rPr>
-        <w:t xml:space="preserve">informativa e il titolo della pagina del sito.</w:t>
+        <w:t xml:space="preserve">Le parole chiave hanno altri posti, consentiti e utili: la categoria (sezione 4), i servizi della scheda, la descrizione informativa e il titolo della pagina del sito.</w:t>
       </w:r>
     </w:p>
     <w:p>
@@ -1186,22 +1045,7 @@
           <w:sz w:val="21"/>
           <w:szCs w:val="21"/>
         </w:rPr>
-        <w:t xml:space="preserve"> le visite dalle schede restano nel canale «Organic Search» di Google Analytics e si distinguono</w:t>
-      </w:r>
-    </w:p>
-    <w:p>
-      <w:pPr>
-        <w:spacing w:after="120" w:before="0" w:line="290"/>
-        <w:jc w:val="both"/>
-      </w:pPr>
-      <w:r>
-        <w:rPr>
-          <w:rFonts w:ascii="Arial" w:cs="Arial" w:eastAsia="Arial" w:hAnsi="Arial"/>
-          <w:color w:val="20262B"/>
-          <w:sz w:val="21"/>
-          <w:szCs w:val="21"/>
-        </w:rPr>
-        <w:t xml:space="preserve">dalla campagna </w:t>
+        <w:t xml:space="preserve"> le visite dalle schede restano nel canale «Organic Search» di Google Analytics e si distinguono dalla campagna </w:t>
       </w:r>
       <w:r>
         <w:rPr>
@@ -1219,22 +1063,7 @@
           <w:sz w:val="21"/>
           <w:szCs w:val="21"/>
         </w:rPr>
-        <w:t xml:space="preserve">. Tenendo i parametri fuori dall'archivio, le pagine del sito e il dato strutturato restano sull'URL</w:t>
-      </w:r>
-    </w:p>
-    <w:p>
-      <w:pPr>
-        <w:spacing w:after="120" w:before="0" w:line="290"/>
-        <w:jc w:val="both"/>
-      </w:pPr>
-      <w:r>
-        <w:rPr>
-          <w:rFonts w:ascii="Arial" w:cs="Arial" w:eastAsia="Arial" w:hAnsi="Arial"/>
-          <w:color w:val="20262B"/>
-          <w:sz w:val="21"/>
-          <w:szCs w:val="21"/>
-        </w:rPr>
-        <w:t xml:space="preserve">pulito.</w:t>
+        <w:t xml:space="preserve">. Tenendo i parametri fuori dall'archivio, le pagine del sito e il dato strutturato restano sull'URL pulito.</w:t>
       </w:r>
     </w:p>
     <w:p>
@@ -1370,52 +1199,23 @@
           <w:sz w:val="21"/>
           <w:szCs w:val="21"/>
         </w:rPr>
-        <w:t xml:space="preserve">Le categorie si indicano per codice, non per nome: in italiano alcuni nomi compaiono due volte e indicano categorie</w:t>
-      </w:r>
-    </w:p>
-    <w:p>
-      <w:pPr>
-        <w:spacing w:after="120" w:before="0" w:line="290"/>
-        <w:jc w:val="both"/>
-      </w:pPr>
-      <w:r>
-        <w:rPr>
-          <w:rFonts w:ascii="Arial" w:cs="Arial" w:eastAsia="Arial" w:hAnsi="Arial"/>
-          <w:color w:val="20262B"/>
-          <w:sz w:val="21"/>
-          <w:szCs w:val="21"/>
-        </w:rPr>
-        <w:t xml:space="preserve">diverse (per esempio «Casa di riposo»). I codici li conferma RetailTune prima del passaggio. RetailTune mantiene le</w:t>
-      </w:r>
-    </w:p>
-    <w:p>
-      <w:pPr>
-        <w:spacing w:after="120" w:before="0" w:line="290"/>
-        <w:jc w:val="both"/>
-      </w:pPr>
-      <w:r>
-        <w:rPr>
-          <w:rFonts w:ascii="Arial" w:cs="Arial" w:eastAsia="Arial" w:hAnsi="Arial"/>
-          <w:color w:val="20262B"/>
-          <w:sz w:val="21"/>
-          <w:szCs w:val="21"/>
-        </w:rPr>
-        <w:t xml:space="preserve">categorie principali attuali e non ne cambia nessuna senza accordo scritto.</w:t>
-      </w:r>
-    </w:p>
-    <w:p>
-      <w:pPr>
-        <w:spacing w:after="120" w:before="0" w:line="290"/>
-        <w:jc w:val="both"/>
-      </w:pPr>
-      <w:r>
-        <w:rPr>
-          <w:rFonts w:ascii="Arial" w:cs="Arial" w:eastAsia="Arial" w:hAnsi="Arial"/>
-          <w:color w:val="20262B"/>
-          <w:sz w:val="21"/>
-          <w:szCs w:val="21"/>
-        </w:rPr>
-        <w:t xml:space="preserve">### Residenze Anni Azzurri (57 residenze aperte)</w:t>
+        <w:t xml:space="preserve">Le categorie si indicano per codice, non per nome: in italiano alcuni nomi compaiono due volte e indicano categorie diverse (per esempio «Casa di riposo»). I codici li conferma RetailTune prima del passaggio. RetailTune mantiene le categorie principali attuali e non ne cambia nessuna senza accordo scritto.</w:t>
+      </w:r>
+    </w:p>
+    <w:p>
+      <w:pPr>
+        <w:spacing w:after="100" w:before="200"/>
+      </w:pPr>
+      <w:r>
+        <w:rPr>
+          <w:rFonts w:ascii="Arial" w:cs="Arial" w:eastAsia="Arial" w:hAnsi="Arial"/>
+          <w:b/>
+          <w:bCs/>
+          <w:color w:val="1F5C6E"/>
+          <w:sz w:val="22"/>
+          <w:szCs w:val="22"/>
+        </w:rPr>
+        <w:t xml:space="preserve">Residenze Anni Azzurri (57 residenze aperte)</w:t>
       </w:r>
     </w:p>
     <w:tbl>
@@ -2376,22 +2176,7 @@
           <w:sz w:val="21"/>
           <w:szCs w:val="21"/>
         </w:rPr>
-        <w:t xml:space="preserve">I concorrenti diretti (Korian, Sereni Orizzonti, Gruppo La Villa, Gheron) usano «Casa di riposo» come principale. Nelle</w:t>
-      </w:r>
-    </w:p>
-    <w:p>
-      <w:pPr>
-        <w:spacing w:after="120" w:before="180" w:line="290"/>
-        <w:jc w:val="both"/>
-      </w:pPr>
-      <w:r>
-        <w:rPr>
-          <w:rFonts w:ascii="Arial" w:cs="Arial" w:eastAsia="Arial" w:hAnsi="Arial"/>
-          <w:color w:val="20262B"/>
-          <w:sz w:val="21"/>
-          <w:szCs w:val="21"/>
-        </w:rPr>
-        <w:t xml:space="preserve">  ricerche «RSA Milano» e «casa di riposo Torino», 19 risultati su 20 hanno questa categoria.</w:t>
+        <w:t xml:space="preserve">I concorrenti diretti (Korian, Sereni Orizzonti, Gruppo La Villa, Gheron) usano «Casa di riposo» come principale. Nelle ricerche «RSA Milano» e «casa di riposo Torino», 19 risultati su 20 hanno questa categoria.</w:t>
       </w:r>
     </w:p>
     <w:p>
@@ -2431,37 +2216,23 @@
           <w:sz w:val="21"/>
           <w:szCs w:val="21"/>
         </w:rPr>
-        <w:t xml:space="preserve">Il selettore italiano non ha categorie per Alzheimer, demenza, residenza assistita o hospice. Se esistono nel catalogo</w:t>
-      </w:r>
-    </w:p>
-    <w:p>
-      <w:pPr>
-        <w:spacing w:after="120" w:before="180" w:line="290"/>
-        <w:jc w:val="both"/>
-      </w:pPr>
-      <w:r>
-        <w:rPr>
-          <w:rFonts w:ascii="Arial" w:cs="Arial" w:eastAsia="Arial" w:hAnsi="Arial"/>
-          <w:color w:val="20262B"/>
-          <w:sz w:val="21"/>
-          <w:szCs w:val="21"/>
-        </w:rPr>
-        <w:t xml:space="preserve">  globale con un codice diverso, RetailTune lo verifica.</w:t>
-      </w:r>
-    </w:p>
-    <w:p>
-      <w:pPr>
-        <w:spacing w:after="120" w:before="0" w:line="290"/>
-        <w:jc w:val="both"/>
-      </w:pPr>
-      <w:r>
-        <w:rPr>
-          <w:rFonts w:ascii="Arial" w:cs="Arial" w:eastAsia="Arial" w:hAnsi="Arial"/>
-          <w:color w:val="20262B"/>
-          <w:sz w:val="21"/>
-          <w:szCs w:val="21"/>
-        </w:rPr>
-        <w:t xml:space="preserve">### Strutture KOS</w:t>
+        <w:t xml:space="preserve">Il selettore italiano non ha categorie per Alzheimer, demenza, residenza assistita o hospice. Se esistono nel catalogo globale con un codice diverso, RetailTune lo verifica.</w:t>
+      </w:r>
+    </w:p>
+    <w:p>
+      <w:pPr>
+        <w:spacing w:after="100" w:before="200"/>
+      </w:pPr>
+      <w:r>
+        <w:rPr>
+          <w:rFonts w:ascii="Arial" w:cs="Arial" w:eastAsia="Arial" w:hAnsi="Arial"/>
+          <w:b/>
+          <w:bCs/>
+          <w:color w:val="1F5C6E"/>
+          <w:sz w:val="22"/>
+          <w:szCs w:val="22"/>
+        </w:rPr>
+        <w:t xml:space="preserve">Strutture KOS</w:t>
       </w:r>
     </w:p>
     <w:tbl>
@@ -3802,22 +3573,7 @@
           <w:sz w:val="21"/>
           <w:szCs w:val="21"/>
         </w:rPr>
-        <w:t xml:space="preserve">Le categorie per professionista come «Psichiatra», «Pediatra» e «Fisiatra» descrivono un singolo medico. Sulla scheda di</w:t>
-      </w:r>
-    </w:p>
-    <w:p>
-      <w:pPr>
-        <w:spacing w:after="120" w:before="0" w:line="290"/>
-        <w:jc w:val="both"/>
-      </w:pPr>
-      <w:r>
-        <w:rPr>
-          <w:rFonts w:ascii="Arial" w:cs="Arial" w:eastAsia="Arial" w:hAnsi="Arial"/>
-          <w:color w:val="20262B"/>
-          <w:sz w:val="21"/>
-          <w:szCs w:val="21"/>
-        </w:rPr>
-        <w:t xml:space="preserve">una struttura fanno classificare l'intera sede come studio medico, e la allontanano dalle ricerche per tipo di struttura.</w:t>
+        <w:t xml:space="preserve">Le categorie per professionista come «Psichiatra», «Pediatra» e «Fisiatra» descrivono un singolo medico. Sulla scheda di una struttura fanno classificare l'intera sede come studio medico, e la allontanano dalle ricerche per tipo di struttura.</w:t>
       </w:r>
     </w:p>
     <w:p>
@@ -3899,22 +3655,7 @@
           <w:sz w:val="21"/>
           <w:szCs w:val="21"/>
         </w:rPr>
-        <w:t xml:space="preserve"> un riscontro sulle categorie della sezione 4 entro la call del 4 novembre, in particolare sui centri</w:t>
-      </w:r>
-    </w:p>
-    <w:p>
-      <w:pPr>
-        <w:spacing w:after="120" w:before="180" w:line="290"/>
-        <w:jc w:val="both"/>
-      </w:pPr>
-      <w:r>
-        <w:rPr>
-          <w:rFonts w:ascii="Arial" w:cs="Arial" w:eastAsia="Arial" w:hAnsi="Arial"/>
-          <w:color w:val="20262B"/>
-          <w:sz w:val="21"/>
-          <w:szCs w:val="21"/>
-        </w:rPr>
-        <w:t xml:space="preserve">  ambulatoriali e sulle comunità terapeutiche, dove la proposta cambia la categoria principale.</w:t>
+        <w:t xml:space="preserve"> un riscontro sulle categorie della sezione 4 entro la call del 4 novembre, in particolare sui centri ambulatoriali e sulle comunità terapeutiche, dove la proposta cambia la categoria principale.</w:t>
       </w:r>
     </w:p>
     <w:p>

</xml_diff>